<commit_message>
Add OFI draft saving + publish to R-QMS-018
</commit_message>
<xml_diff>
--- a/templates/F-QMS-007_template_fixed_v6.docx
+++ b/templates/F-QMS-007_template_fixed_v6.docx
@@ -506,7 +506,15 @@
                     </w:rPr>
                   </w:pPr>
                   <w:r>
-                    <w:t>${refNo}</w:t>
+                    <w:t>${</w:t>
+                  </w:r>
+                  <w:proofErr w:type="spellStart"/>
+                  <w:r>
+                    <w:t>refNo</w:t>
+                  </w:r>
+                  <w:proofErr w:type="spellEnd"/>
+                  <w:r>
+                    <w:t>}</w:t>
                   </w:r>
                 </w:p>
               </w:tc>
@@ -736,7 +744,15 @@
                     </w:rPr>
                   </w:pPr>
                   <w:r>
-                    <w:t>${ofiNo}</w:t>
+                    <w:t>${</w:t>
+                  </w:r>
+                  <w:proofErr w:type="spellStart"/>
+                  <w:r>
+                    <w:t>ofiNo</w:t>
+                  </w:r>
+                  <w:proofErr w:type="spellEnd"/>
+                  <w:r>
+                    <w:t>}</w:t>
                   </w:r>
                 </w:p>
               </w:tc>
@@ -1183,7 +1199,15 @@
                     </w:rPr>
                   </w:pPr>
                   <w:r>
-                    <w:t>${isoClause}</w:t>
+                    <w:t>${</w:t>
+                  </w:r>
+                  <w:proofErr w:type="spellStart"/>
+                  <w:r>
+                    <w:t>isoClause</w:t>
+                  </w:r>
+                  <w:proofErr w:type="spellEnd"/>
+                  <w:r>
+                    <w:t>}</w:t>
                   </w:r>
                 </w:p>
               </w:tc>
@@ -1337,7 +1361,21 @@
                     <w:rPr>
                       <w:rFonts w:ascii="Arial" w:hAnsi="Arial" w:cs="Arial"/>
                     </w:rPr>
-                    <w:t>(if applicable)</w:t>
+                    <w:t>(</w:t>
+                  </w:r>
+                  <w:proofErr w:type="gramStart"/>
+                  <w:r>
+                    <w:rPr>
+                      <w:rFonts w:ascii="Arial" w:hAnsi="Arial" w:cs="Arial"/>
+                    </w:rPr>
+                    <w:t>if</w:t>
+                  </w:r>
+                  <w:proofErr w:type="gramEnd"/>
+                  <w:r>
+                    <w:rPr>
+                      <w:rFonts w:ascii="Arial" w:hAnsi="Arial" w:cs="Arial"/>
+                    </w:rPr>
+                    <w:t xml:space="preserve"> applicable)</w:t>
                   </w:r>
                 </w:p>
               </w:tc>
@@ -1425,7 +1463,21 @@
               <w:rPr>
                 <w:rFonts w:ascii="Arial" w:hAnsi="Arial"/>
               </w:rPr>
-              <w:t>${sourceIqa}</w:t>
+              <w:t>${</w:t>
+            </w:r>
+            <w:proofErr w:type="spellStart"/>
+            <w:r>
+              <w:rPr>
+                <w:rFonts w:ascii="Arial" w:hAnsi="Arial"/>
+              </w:rPr>
+              <w:t>sourceIqa</w:t>
+            </w:r>
+            <w:proofErr w:type="spellEnd"/>
+            <w:r>
+              <w:rPr>
+                <w:rFonts w:ascii="Arial" w:hAnsi="Arial"/>
+              </w:rPr>
+              <w:t>}</w:t>
             </w:r>
             <w:r>
               <w:rPr>
@@ -1449,7 +1501,21 @@
               <w:rPr>
                 <w:rFonts w:ascii="Arial" w:hAnsi="Arial"/>
               </w:rPr>
-              <w:t>${sourceFeedback}</w:t>
+              <w:t>${</w:t>
+            </w:r>
+            <w:proofErr w:type="spellStart"/>
+            <w:r>
+              <w:rPr>
+                <w:rFonts w:ascii="Arial" w:hAnsi="Arial"/>
+              </w:rPr>
+              <w:t>sourceFeedback</w:t>
+            </w:r>
+            <w:proofErr w:type="spellEnd"/>
+            <w:r>
+              <w:rPr>
+                <w:rFonts w:ascii="Arial" w:hAnsi="Arial"/>
+              </w:rPr>
+              <w:t>}</w:t>
             </w:r>
             <w:r>
               <w:rPr>
@@ -1473,7 +1539,21 @@
               <w:rPr>
                 <w:rFonts w:ascii="Arial" w:hAnsi="Arial"/>
               </w:rPr>
-              <w:t>${sourceSurvey}</w:t>
+              <w:t>${</w:t>
+            </w:r>
+            <w:proofErr w:type="spellStart"/>
+            <w:r>
+              <w:rPr>
+                <w:rFonts w:ascii="Arial" w:hAnsi="Arial"/>
+              </w:rPr>
+              <w:t>sourceSurvey</w:t>
+            </w:r>
+            <w:proofErr w:type="spellEnd"/>
+            <w:r>
+              <w:rPr>
+                <w:rFonts w:ascii="Arial" w:hAnsi="Arial"/>
+              </w:rPr>
+              <w:t>}</w:t>
             </w:r>
             <w:r>
               <w:rPr>
@@ -1497,7 +1577,21 @@
               <w:rPr>
                 <w:rFonts w:ascii="Arial" w:hAnsi="Arial"/>
               </w:rPr>
-              <w:t>${sourceSystem}</w:t>
+              <w:t>${</w:t>
+            </w:r>
+            <w:proofErr w:type="spellStart"/>
+            <w:r>
+              <w:rPr>
+                <w:rFonts w:ascii="Arial" w:hAnsi="Arial"/>
+              </w:rPr>
+              <w:t>sourceSystem</w:t>
+            </w:r>
+            <w:proofErr w:type="spellEnd"/>
+            <w:r>
+              <w:rPr>
+                <w:rFonts w:ascii="Arial" w:hAnsi="Arial"/>
+              </w:rPr>
+              <w:t>}</w:t>
             </w:r>
             <w:r>
               <w:rPr>
@@ -1521,7 +1615,21 @@
               <w:rPr>
                 <w:rFonts w:ascii="Arial" w:hAnsi="Arial"/>
               </w:rPr>
-              <w:t>${sourceOthersCheck}</w:t>
+              <w:t>${</w:t>
+            </w:r>
+            <w:proofErr w:type="spellStart"/>
+            <w:r>
+              <w:rPr>
+                <w:rFonts w:ascii="Arial" w:hAnsi="Arial"/>
+              </w:rPr>
+              <w:t>sourceOthersCheck</w:t>
+            </w:r>
+            <w:proofErr w:type="spellEnd"/>
+            <w:r>
+              <w:rPr>
+                <w:rFonts w:ascii="Arial" w:hAnsi="Arial"/>
+              </w:rPr>
+              <w:t>}</w:t>
             </w:r>
             <w:r>
               <w:rPr>
@@ -1540,7 +1648,23 @@
                 <w:rFonts w:ascii="Arial" w:hAnsi="Arial"/>
                 <w:u w:val="single"/>
               </w:rPr>
-              <w:t>${sourceOthersText}</w:t>
+              <w:t>${</w:t>
+            </w:r>
+            <w:proofErr w:type="spellStart"/>
+            <w:r>
+              <w:rPr>
+                <w:rFonts w:ascii="Arial" w:hAnsi="Arial"/>
+                <w:u w:val="single"/>
+              </w:rPr>
+              <w:t>sourceOthersText</w:t>
+            </w:r>
+            <w:proofErr w:type="spellEnd"/>
+            <w:r>
+              <w:rPr>
+                <w:rFonts w:ascii="Arial" w:hAnsi="Arial"/>
+                <w:u w:val="single"/>
+              </w:rPr>
+              <w:t>}</w:t>
             </w:r>
           </w:p>
         </w:tc>
@@ -1744,7 +1868,21 @@
                     <w:rPr>
                       <w:rFonts w:ascii="Arial" w:hAnsi="Arial" w:cs="Arial"/>
                     </w:rPr>
-                    <w:t>${requestedBySig}</w:t>
+                    <w:t>${</w:t>
+                  </w:r>
+                  <w:proofErr w:type="spellStart"/>
+                  <w:r>
+                    <w:rPr>
+                      <w:rFonts w:ascii="Arial" w:hAnsi="Arial" w:cs="Arial"/>
+                    </w:rPr>
+                    <w:t>requestedBySig</w:t>
+                  </w:r>
+                  <w:proofErr w:type="spellEnd"/>
+                  <w:r>
+                    <w:rPr>
+                      <w:rFonts w:ascii="Arial" w:hAnsi="Arial" w:cs="Arial"/>
+                    </w:rPr>
+                    <w:t>}</w:t>
                   </w:r>
                 </w:p>
               </w:tc>
@@ -1797,7 +1935,18 @@
                     <w:rPr>
                       <w:rFonts w:ascii="Arial" w:hAnsi="Arial" w:cs="Arial"/>
                     </w:rPr>
-                    <w:t>${requestedBySig} </w:t>
+                    <w:t>${</w:t>
+                  </w:r>
+                  <w:proofErr w:type="spellStart"/>
+                  <w:r>
+                    <w:t>agreedDate</w:t>
+                  </w:r>
+                  <w:proofErr w:type="spellEnd"/>
+                  <w:r>
+                    <w:rPr>
+                      <w:rFonts w:ascii="Arial" w:hAnsi="Arial" w:cs="Arial"/>
+                    </w:rPr>
+                    <w:t>} </w:t>
                   </w:r>
                 </w:p>
               </w:tc>
@@ -2238,7 +2387,21 @@
               <w:rPr>
                 <w:rFonts w:ascii="Arial" w:hAnsi="Arial" w:cs="Arial"/>
               </w:rPr>
-              <w:t>${beneficialImpact}</w:t>
+              <w:t>${</w:t>
+            </w:r>
+            <w:proofErr w:type="spellStart"/>
+            <w:r>
+              <w:rPr>
+                <w:rFonts w:ascii="Arial" w:hAnsi="Arial" w:cs="Arial"/>
+              </w:rPr>
+              <w:t>beneficialImpact</w:t>
+            </w:r>
+            <w:proofErr w:type="spellEnd"/>
+            <w:r>
+              <w:rPr>
+                <w:rFonts w:ascii="Arial" w:hAnsi="Arial" w:cs="Arial"/>
+              </w:rPr>
+              <w:t>}</w:t>
             </w:r>
           </w:p>
           <w:p>
@@ -2306,7 +2469,21 @@
               <w:rPr>
                 <w:rFonts w:ascii="Arial" w:hAnsi="Arial" w:cs="Arial"/>
               </w:rPr>
-              <w:t>${associatedRisks}</w:t>
+              <w:t>${</w:t>
+            </w:r>
+            <w:proofErr w:type="spellStart"/>
+            <w:r>
+              <w:rPr>
+                <w:rFonts w:ascii="Arial" w:hAnsi="Arial" w:cs="Arial"/>
+              </w:rPr>
+              <w:t>associatedRisks</w:t>
+            </w:r>
+            <w:proofErr w:type="spellEnd"/>
+            <w:r>
+              <w:rPr>
+                <w:rFonts w:ascii="Arial" w:hAnsi="Arial" w:cs="Arial"/>
+              </w:rPr>
+              <w:t>}</w:t>
             </w:r>
           </w:p>
           <w:p>
@@ -2858,7 +3035,21 @@
                     <w:rPr>
                       <w:rFonts w:ascii="Arial" w:hAnsi="Arial" w:cs="Arial"/>
                     </w:rPr>
-                    <w:t>${dateUpdated}</w:t>
+                    <w:t>${</w:t>
+                  </w:r>
+                  <w:proofErr w:type="spellStart"/>
+                  <w:r>
+                    <w:rPr>
+                      <w:rFonts w:ascii="Arial" w:hAnsi="Arial" w:cs="Arial"/>
+                    </w:rPr>
+                    <w:t>dateUpdated</w:t>
+                  </w:r>
+                  <w:proofErr w:type="spellEnd"/>
+                  <w:r>
+                    <w:rPr>
+                      <w:rFonts w:ascii="Arial" w:hAnsi="Arial" w:cs="Arial"/>
+                    </w:rPr>
+                    <w:t>}</w:t>
                   </w:r>
                 </w:p>
               </w:tc>
@@ -3201,7 +3392,21 @@
                     <w:rPr>
                       <w:rFonts w:ascii="Arial" w:hAnsi="Arial" w:cs="Arial"/>
                     </w:rPr>
-                    <w:t>${dcrUpdated}</w:t>
+                    <w:t>${</w:t>
+                  </w:r>
+                  <w:proofErr w:type="spellStart"/>
+                  <w:r>
+                    <w:rPr>
+                      <w:rFonts w:ascii="Arial" w:hAnsi="Arial" w:cs="Arial"/>
+                    </w:rPr>
+                    <w:t>dcrUpdated</w:t>
+                  </w:r>
+                  <w:proofErr w:type="spellEnd"/>
+                  <w:r>
+                    <w:rPr>
+                      <w:rFonts w:ascii="Arial" w:hAnsi="Arial" w:cs="Arial"/>
+                    </w:rPr>
+                    <w:t>}</w:t>
                   </w:r>
                 </w:p>
               </w:tc>
@@ -3365,7 +3570,7 @@
                 </mc:Choice>
                 <mc:Fallback>
                   <w:pict>
-                    <v:line w14:anchorId="475DA5E4" id="Straight Connector 2" o:spid="_x0000_s1026" style="position:absolute;z-index:251659776;visibility:visible;mso-wrap-style:square;mso-width-percent:0;mso-height-percent:0;mso-wrap-distance-left:9pt;mso-wrap-distance-top:0;mso-wrap-distance-right:9pt;mso-wrap-distance-bottom:0;mso-position-horizontal:absolute;mso-position-horizontal-relative:text;mso-position-vertical:absolute;mso-position-vertical-relative:text;mso-width-percent:0;mso-height-percent:0;mso-width-relative:margin;mso-height-relative:margin" from="394.2pt,10pt" to="458.7pt,10pt" o:gfxdata="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" strokecolor="black [3200]" strokeweight="1pt">
+                    <v:line w14:anchorId="446B81BF" id="Straight Connector 2" o:spid="_x0000_s1026" style="position:absolute;z-index:251659776;visibility:visible;mso-wrap-style:square;mso-width-percent:0;mso-height-percent:0;mso-wrap-distance-left:9pt;mso-wrap-distance-top:0;mso-wrap-distance-right:9pt;mso-wrap-distance-bottom:0;mso-position-horizontal:absolute;mso-position-horizontal-relative:text;mso-position-vertical:absolute;mso-position-vertical-relative:text;mso-width-percent:0;mso-height-percent:0;mso-width-relative:margin;mso-height-relative:margin" from="394.2pt,10pt" to="458.7pt,10pt" o:gfxdata="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" strokecolor="black [3200]" strokeweight="1pt">
                       <v:stroke joinstyle="miter"/>
                     </v:line>
                   </w:pict>
@@ -3392,11 +3597,19 @@
               </w:rPr>
               <w:t>${</w:t>
             </w:r>
+            <w:proofErr w:type="spellStart"/>
             <w:r>
               <w:rPr>
                 <w:rFonts w:ascii="Arial" w:hAnsi="Arial" w:cs="Arial"/>
               </w:rPr>
-              <w:t>followsig}</w:t>
+              <w:t>followsig</w:t>
+            </w:r>
+            <w:proofErr w:type="spellEnd"/>
+            <w:r>
+              <w:rPr>
+                <w:rFonts w:ascii="Arial" w:hAnsi="Arial" w:cs="Arial"/>
+              </w:rPr>
+              <w:t>}</w:t>
             </w:r>
           </w:p>
           <w:p>
@@ -4697,7 +4910,15 @@
                     </w:rPr>
                   </w:pPr>
                   <w:r>
-                    <w:t>${imrSig}</w:t>
+                    <w:t>${</w:t>
+                  </w:r>
+                  <w:proofErr w:type="spellStart"/>
+                  <w:r>
+                    <w:t>imrSig</w:t>
+                  </w:r>
+                  <w:proofErr w:type="spellEnd"/>
+                  <w:r>
+                    <w:t>}</w:t>
                   </w:r>
                 </w:p>
               </w:tc>
@@ -4736,7 +4957,15 @@
                     </w:rPr>
                   </w:pPr>
                   <w:r>
-                    <w:t>${caseClosedDate}</w:t>
+                    <w:t>${</w:t>
+                  </w:r>
+                  <w:proofErr w:type="spellStart"/>
+                  <w:r>
+                    <w:t>caseClosedDate</w:t>
+                  </w:r>
+                  <w:proofErr w:type="spellEnd"/>
+                  <w:r>
+                    <w:t>}</w:t>
                   </w:r>
                 </w:p>
               </w:tc>
@@ -4775,7 +5004,15 @@
                     </w:rPr>
                   </w:pPr>
                   <w:r>
-                    <w:t>${notedBy}</w:t>
+                    <w:t>${</w:t>
+                  </w:r>
+                  <w:proofErr w:type="spellStart"/>
+                  <w:r>
+                    <w:t>notedBy</w:t>
+                  </w:r>
+                  <w:proofErr w:type="spellEnd"/>
+                  <w:r>
+                    <w:t>}</w:t>
                   </w:r>
                 </w:p>
               </w:tc>

</xml_diff>

<commit_message>
Fixed the Update draft
</commit_message>
<xml_diff>
--- a/templates/F-QMS-007_template_fixed_v6.docx
+++ b/templates/F-QMS-007_template_fixed_v6.docx
@@ -380,6 +380,9 @@
                     </w:rPr>
                   </w:pPr>
                   <w:r>
+                    <w:rPr>
+                      <w:rFonts w:ascii="Arial" w:hAnsi="Arial" w:cs="Arial"/>
+                    </w:rPr>
                     <w:t>${date}</w:t>
                   </w:r>
                 </w:p>
@@ -506,14 +509,23 @@
                     </w:rPr>
                   </w:pPr>
                   <w:r>
+                    <w:rPr>
+                      <w:rFonts w:ascii="Arial" w:hAnsi="Arial" w:cs="Arial"/>
+                    </w:rPr>
                     <w:t>${</w:t>
                   </w:r>
                   <w:proofErr w:type="spellStart"/>
                   <w:r>
+                    <w:rPr>
+                      <w:rFonts w:ascii="Arial" w:hAnsi="Arial" w:cs="Arial"/>
+                    </w:rPr>
                     <w:t>refNo</w:t>
                   </w:r>
                   <w:proofErr w:type="spellEnd"/>
                   <w:r>
+                    <w:rPr>
+                      <w:rFonts w:ascii="Arial" w:hAnsi="Arial" w:cs="Arial"/>
+                    </w:rPr>
                     <w:t>}</w:t>
                   </w:r>
                 </w:p>
@@ -618,6 +630,9 @@
                     </w:rPr>
                   </w:pPr>
                   <w:r>
+                    <w:rPr>
+                      <w:rFonts w:ascii="Arial" w:hAnsi="Arial" w:cs="Arial"/>
+                    </w:rPr>
                     <w:t>${to}</w:t>
                   </w:r>
                 </w:p>
@@ -744,14 +759,23 @@
                     </w:rPr>
                   </w:pPr>
                   <w:r>
+                    <w:rPr>
+                      <w:rFonts w:ascii="Arial" w:hAnsi="Arial" w:cs="Arial"/>
+                    </w:rPr>
                     <w:t>${</w:t>
                   </w:r>
                   <w:proofErr w:type="spellStart"/>
                   <w:r>
+                    <w:rPr>
+                      <w:rFonts w:ascii="Arial" w:hAnsi="Arial" w:cs="Arial"/>
+                    </w:rPr>
                     <w:t>ofiNo</w:t>
                   </w:r>
                   <w:proofErr w:type="spellEnd"/>
                   <w:r>
+                    <w:rPr>
+                      <w:rFonts w:ascii="Arial" w:hAnsi="Arial" w:cs="Arial"/>
+                    </w:rPr>
                     <w:t>}</w:t>
                   </w:r>
                 </w:p>
@@ -1069,10 +1093,7 @@
                     <w:rPr>
                       <w:rFonts w:ascii="Arial" w:hAnsi="Arial" w:cs="Arial"/>
                     </w:rPr>
-                    <w:t xml:space="preserve"> </w:t>
-                  </w:r>
-                  <w:r>
-                    <w:t>${from}</w:t>
+                    <w:t xml:space="preserve"> ${from}</w:t>
                   </w:r>
                 </w:p>
               </w:tc>
@@ -1199,14 +1220,23 @@
                     </w:rPr>
                   </w:pPr>
                   <w:r>
+                    <w:rPr>
+                      <w:rFonts w:ascii="Arial" w:hAnsi="Arial" w:cs="Arial"/>
+                    </w:rPr>
                     <w:t>${</w:t>
                   </w:r>
                   <w:proofErr w:type="spellStart"/>
                   <w:r>
+                    <w:rPr>
+                      <w:rFonts w:ascii="Arial" w:hAnsi="Arial" w:cs="Arial"/>
+                    </w:rPr>
                     <w:t>isoClause</w:t>
                   </w:r>
                   <w:proofErr w:type="spellEnd"/>
                   <w:r>
+                    <w:rPr>
+                      <w:rFonts w:ascii="Arial" w:hAnsi="Arial" w:cs="Arial"/>
+                    </w:rPr>
                     <w:t>}</w:t>
                   </w:r>
                 </w:p>
@@ -3570,7 +3600,7 @@
                 </mc:Choice>
                 <mc:Fallback>
                   <w:pict>
-                    <v:line w14:anchorId="446B81BF" id="Straight Connector 2" o:spid="_x0000_s1026" style="position:absolute;z-index:251659776;visibility:visible;mso-wrap-style:square;mso-width-percent:0;mso-height-percent:0;mso-wrap-distance-left:9pt;mso-wrap-distance-top:0;mso-wrap-distance-right:9pt;mso-wrap-distance-bottom:0;mso-position-horizontal:absolute;mso-position-horizontal-relative:text;mso-position-vertical:absolute;mso-position-vertical-relative:text;mso-width-percent:0;mso-height-percent:0;mso-width-relative:margin;mso-height-relative:margin" from="394.2pt,10pt" to="458.7pt,10pt" o:gfxdata="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" strokecolor="black [3200]" strokeweight="1pt">
+                    <v:line w14:anchorId="4590B792" id="Straight Connector 2" o:spid="_x0000_s1026" style="position:absolute;z-index:251659776;visibility:visible;mso-wrap-style:square;mso-width-percent:0;mso-height-percent:0;mso-wrap-distance-left:9pt;mso-wrap-distance-top:0;mso-wrap-distance-right:9pt;mso-wrap-distance-bottom:0;mso-position-horizontal:absolute;mso-position-horizontal-relative:text;mso-position-vertical:absolute;mso-position-vertical-relative:text;mso-width-percent:0;mso-height-percent:0;mso-width-relative:margin;mso-height-relative:margin" from="394.2pt,10pt" to="458.7pt,10pt" o:gfxdata="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" strokecolor="black [3200]" strokeweight="1pt">
                       <v:stroke joinstyle="miter"/>
                     </v:line>
                   </w:pict>

</xml_diff>